<commit_message>
Finished Half of The Documentation
</commit_message>
<xml_diff>
--- a/UseCases/Use Cases.docx
+++ b/UseCases/Use Cases.docx
@@ -902,31 +902,6 @@
         </w:rPr>
         <w:t>anage their financial details and track payouts from sales.</w:t>
       </w:r>
-    </w:p>
-    <w:p>
-      <w:pPr>
-        <w:pStyle w:val="ListParagraph"/>
-        <w:numPr>
-          <w:ilvl w:val="0"/>
-          <w:numId w:val="5"/>
-        </w:numPr>
-        <w:rPr>
-          <w:sz w:val="40"/>
-        </w:rPr>
-      </w:pPr>
-      <w:r>
-        <w:rPr>
-          <w:sz w:val="40"/>
-        </w:rPr>
-        <w:t>view customer ratings and feedback on their products</w:t>
-      </w:r>
-    </w:p>
-    <w:p>
-      <w:pPr>
-        <w:rPr>
-          <w:sz w:val="40"/>
-        </w:rPr>
-      </w:pPr>
     </w:p>
     <w:p>
       <w:pPr>

</xml_diff>